<commit_message>
Improve application document printing
Render the complete populated Word document in the browser print view and align guardian and principal signature fields with their dates in a table.

Co-authored-by: Copilot <223556219+Copilot@users.noreply.github.com>

Copilot-Session: dc045078-7d35-4ca3-b3d0-dad33d481668
</commit_message>
<xml_diff>
--- a/templates/TurksWithoutBordersProgramv2.docx
+++ b/templates/TurksWithoutBordersProgramv2.docx
@@ -2662,36 +2662,6 @@
           <w:lang w:val="tr-TR"/>
         </w:rPr>
       </w:pPr>
-      <w:r>
-        <w:rPr>
-          <w:lang w:val="tr-TR"/>
-        </w:rPr>
-        <w:t xml:space="preserve">Velinin Adi, </w:t>
-      </w:r>
-      <w:r>
-        <w:rPr>
-          <w:lang w:val="tr-TR"/>
-        </w:rPr>
-        <w:t>Soyadı</w:t>
-      </w:r>
-      <w:r>
-        <w:rPr>
-          <w:lang w:val="tr-TR"/>
-        </w:rPr>
-        <w:t xml:space="preserve">, </w:t>
-      </w:r>
-      <w:r>
-        <w:rPr>
-          <w:lang w:val="tr-TR"/>
-        </w:rPr>
-        <w:t>İmzası</w:t>
-      </w:r>
-      <w:r>
-        <w:rPr>
-          <w:lang w:val="tr-TR"/>
-        </w:rPr>
-        <w:t>:</w:t>
-      </w:r>
     </w:p>
     <w:p>
       <w:pPr>
@@ -2699,12 +2669,6 @@
           <w:lang w:val="tr-TR"/>
         </w:rPr>
       </w:pPr>
-      <w:r>
-        <w:rPr>
-          <w:lang w:val="tr-TR"/>
-        </w:rPr>
-        <w:t>Tarih:</w:t>
-      </w:r>
     </w:p>
     <w:p>
       <w:pPr>
@@ -2719,54 +2683,6 @@
           <w:lang w:val="tr-TR"/>
         </w:rPr>
       </w:pPr>
-      <w:r>
-        <w:rPr>
-          <w:lang w:val="tr-TR"/>
-        </w:rPr>
-        <w:t xml:space="preserve">Okul </w:t>
-      </w:r>
-      <w:proofErr w:type="spellStart"/>
-      <w:r>
-        <w:rPr>
-          <w:lang w:val="tr-TR"/>
-        </w:rPr>
-        <w:t>Muduru</w:t>
-      </w:r>
-      <w:proofErr w:type="spellEnd"/>
-      <w:r>
-        <w:rPr>
-          <w:lang w:val="tr-TR"/>
-        </w:rPr>
-        <w:t xml:space="preserve">, Adi, </w:t>
-      </w:r>
-      <w:proofErr w:type="spellStart"/>
-      <w:r>
-        <w:rPr>
-          <w:lang w:val="tr-TR"/>
-        </w:rPr>
-        <w:t>Soyadi</w:t>
-      </w:r>
-      <w:proofErr w:type="spellEnd"/>
-      <w:r>
-        <w:rPr>
-          <w:lang w:val="tr-TR"/>
-        </w:rPr>
-        <w:t xml:space="preserve">, </w:t>
-      </w:r>
-      <w:proofErr w:type="spellStart"/>
-      <w:r>
-        <w:rPr>
-          <w:lang w:val="tr-TR"/>
-        </w:rPr>
-        <w:t>Imzasi</w:t>
-      </w:r>
-      <w:proofErr w:type="spellEnd"/>
-      <w:r>
-        <w:rPr>
-          <w:lang w:val="tr-TR"/>
-        </w:rPr>
-        <w:t>:</w:t>
-      </w:r>
     </w:p>
     <w:p>
       <w:pPr>
@@ -2774,12 +2690,6 @@
           <w:lang w:val="tr-TR"/>
         </w:rPr>
       </w:pPr>
-      <w:r>
-        <w:rPr>
-          <w:lang w:val="tr-TR"/>
-        </w:rPr>
-        <w:t>Tarih:</w:t>
-      </w:r>
     </w:p>
     <w:p>
       <w:pPr>
@@ -2788,6 +2698,83 @@
         </w:rPr>
       </w:pPr>
     </w:p>
+    <w:tbl>
+      <w:tblPr>
+        <w:tblStyle w:val="TableGrid"/>
+        <w:tblW w:type="auto" w:w="0"/>
+        <w:tblLook w:firstColumn="1" w:firstRow="1" w:lastColumn="0" w:lastRow="0" w:noHBand="0" w:noVBand="1" w:val="04A0"/>
+      </w:tblPr>
+      <w:tblGrid>
+        <w:gridCol w:w="4680"/>
+        <w:gridCol w:w="4680"/>
+      </w:tblGrid>
+      <w:tr>
+        <w:trPr>
+          <w:trHeight w:val="792"/>
+        </w:trPr>
+        <w:tc>
+          <w:tcPr>
+            <w:tcW w:type="dxa" w:w="8064"/>
+            <w:vAlign w:val="center"/>
+          </w:tcPr>
+          <w:p>
+            <w:pPr>
+              <w:spacing w:after="0" w:before="0"/>
+            </w:pPr>
+            <w:r>
+              <w:t>Velinin Adı, Soyadı ve İmzası:</w:t>
+            </w:r>
+          </w:p>
+        </w:tc>
+        <w:tc>
+          <w:tcPr>
+            <w:tcW w:type="dxa" w:w="2592"/>
+            <w:vAlign w:val="center"/>
+          </w:tcPr>
+          <w:p>
+            <w:pPr>
+              <w:spacing w:after="0" w:before="0"/>
+            </w:pPr>
+            <w:r>
+              <w:t>Tarih:</w:t>
+            </w:r>
+          </w:p>
+        </w:tc>
+      </w:tr>
+      <w:tr>
+        <w:trPr>
+          <w:trHeight w:val="792"/>
+        </w:trPr>
+        <w:tc>
+          <w:tcPr>
+            <w:tcW w:type="dxa" w:w="8064"/>
+            <w:vAlign w:val="center"/>
+          </w:tcPr>
+          <w:p>
+            <w:pPr>
+              <w:spacing w:after="0" w:before="0"/>
+            </w:pPr>
+            <w:r>
+              <w:t>Okul Müdürünün Adı, Soyadı ve İmzası:</w:t>
+            </w:r>
+          </w:p>
+        </w:tc>
+        <w:tc>
+          <w:tcPr>
+            <w:tcW w:type="dxa" w:w="2592"/>
+            <w:vAlign w:val="center"/>
+          </w:tcPr>
+          <w:p>
+            <w:pPr>
+              <w:spacing w:after="0" w:before="0"/>
+            </w:pPr>
+            <w:r>
+              <w:t>Tarih:</w:t>
+            </w:r>
+          </w:p>
+        </w:tc>
+      </w:tr>
+    </w:tbl>
     <w:sectPr>
       <w:pgSz w:w="12240" w:h="15840"/>
       <w:pgMar w:top="1440" w:right="1440" w:bottom="1440" w:left="1440" w:header="720" w:footer="720" w:gutter="0"/>

</xml_diff>